<commit_message>
test: cubrir limites de descuento e impuesto
</commit_message>
<xml_diff>
--- a/docs/Criterios_de_aceptacion_pedidos.docx
+++ b/docs/Criterios_de_aceptacion_pedidos.docx
@@ -296,7 +296,7 @@
         <w:t xml:space="preserve">CA5  </w:t>
       </w:r>
       <w:r>
-        <w:t>Para un cliente Regular con subtotal 200, el descuento debe ser 0 porque su tasa es 0 %.</w:t>
+        <w:t>Para un cliente Regular con subtotal 200 o 0, el descuento debe ser 0 porque su tasa es 0 %. El caso con subtotal 0 comprueba el límite inferior.</w:t>
       </w:r>
     </w:p>
     <w:p>
@@ -307,7 +307,7 @@
         <w:t xml:space="preserve">CA6  </w:t>
       </w:r>
       <w:r>
-        <w:t>Para un cliente VIP con subtotal 200, el descuento debe ser 20 porque 200 × 10 % = 20.</w:t>
+        <w:t>Para un cliente VIP con subtotal 200, el descuento debe ser 20 porque 200 × 10 % = 20. Con subtotal 0 también debe ser 0.</w:t>
       </w:r>
     </w:p>
     <w:p>
@@ -323,7 +323,7 @@
         <w:pStyle w:val="Heading3"/>
       </w:pPr>
       <w:r>
-        <w:t>test_descuento_cliente_regular</w:t>
+        <w:t>test_cliente_regular_no_recibe_descuento</w:t>
       </w:r>
     </w:p>
     <w:p>
@@ -337,9 +337,13 @@
           <w:color w:val="242F3E"/>
           <w:sz w:val="14"/>
         </w:rPr>
-        <w:t xml:space="preserve">    [Fact]</w:t>
-        <w:br/>
-        <w:t xml:space="preserve">    public void test_descuento_cliente_regular()</w:t>
+        <w:t xml:space="preserve">    [Theory]</w:t>
+        <w:br/>
+        <w:t xml:space="preserve">    [InlineData(200, 0)]</w:t>
+        <w:br/>
+        <w:t xml:space="preserve">    [InlineData(0, 0)]</w:t>
+        <w:br/>
+        <w:t xml:space="preserve">    public void test_cliente_regular_no_recibe_descuento(decimal subtotal, decimal esperado)</w:t>
         <w:br/>
         <w:t xml:space="preserve">    {</w:t>
         <w:br/>
@@ -351,11 +355,11 @@
         <w:br/>
         <w:t xml:space="preserve">        // Act</w:t>
         <w:br/>
-        <w:t xml:space="preserve">        var descuento = service.CalcularDescuento(cliente, 200m);</w:t>
+        <w:t xml:space="preserve">        var descuento = service.CalcularDescuento(cliente, subtotal);</w:t>
         <w:br/>
         <w:t xml:space="preserve">        // Assert</w:t>
         <w:br/>
-        <w:t xml:space="preserve">        Assert.Equal(0m, descuento);</w:t>
+        <w:t xml:space="preserve">        Assert.Equal(esperado, descuento);</w:t>
         <w:br/>
         <w:t xml:space="preserve">    }</w:t>
       </w:r>
@@ -365,7 +369,7 @@
         <w:pStyle w:val="Heading3"/>
       </w:pPr>
       <w:r>
-        <w:t>test_descuento_cliente_vip</w:t>
+        <w:t>test_cliente_vip_recibe_diez_por_ciento_del_subtotal</w:t>
       </w:r>
     </w:p>
     <w:p>
@@ -379,9 +383,13 @@
           <w:color w:val="242F3E"/>
           <w:sz w:val="14"/>
         </w:rPr>
-        <w:t xml:space="preserve">    [Fact]</w:t>
-        <w:br/>
-        <w:t xml:space="preserve">    public void test_descuento_cliente_vip()</w:t>
+        <w:t xml:space="preserve">    [Theory]</w:t>
+        <w:br/>
+        <w:t xml:space="preserve">    [InlineData(200, 20)]</w:t>
+        <w:br/>
+        <w:t xml:space="preserve">    [InlineData(0, 0)]</w:t>
+        <w:br/>
+        <w:t xml:space="preserve">    public void test_cliente_vip_recibe_diez_por_ciento_del_subtotal(decimal subtotal, decimal esperado)</w:t>
         <w:br/>
         <w:t xml:space="preserve">    {</w:t>
         <w:br/>
@@ -393,11 +401,11 @@
         <w:br/>
         <w:t xml:space="preserve">        // Act</w:t>
         <w:br/>
-        <w:t xml:space="preserve">        var descuento = service.CalcularDescuento(cliente, 200m);</w:t>
+        <w:t xml:space="preserve">        var descuento = service.CalcularDescuento(cliente, subtotal);</w:t>
         <w:br/>
         <w:t xml:space="preserve">        // Assert</w:t>
         <w:br/>
-        <w:t xml:space="preserve">        Assert.Equal(20m, descuento);</w:t>
+        <w:t xml:space="preserve">        Assert.Equal(esperado, descuento);</w:t>
         <w:br/>
         <w:t xml:space="preserve">    }</w:t>
       </w:r>
@@ -434,7 +442,7 @@
         <w:pStyle w:val="Heading3"/>
       </w:pPr>
       <w:r>
-        <w:t>test_descuento_mayorista_segun_monto</w:t>
+        <w:t>test_mayorista_recibe_veinte_por_ciento_solo_si_supera_500</w:t>
       </w:r>
     </w:p>
     <w:p>
@@ -456,7 +464,7 @@
         <w:br/>
         <w:t xml:space="preserve">    [InlineData(400, 20)]</w:t>
         <w:br/>
-        <w:t xml:space="preserve">    public void test_descuento_mayorista_segun_monto(decimal subtotal, decimal esperado)</w:t>
+        <w:t xml:space="preserve">    public void test_mayorista_recibe_veinte_por_ciento_solo_si_supera_500(decimal subtotal, decimal esperado)</w:t>
         <w:br/>
         <w:t xml:space="preserve">    {</w:t>
         <w:br/>
@@ -497,6 +505,17 @@
       </w:r>
     </w:p>
     <w:p>
+      <w:r>
+        <w:rPr>
+          <w:b/>
+        </w:rPr>
+        <w:t xml:space="preserve">CA8a  </w:t>
+      </w:r>
+      <w:r>
+        <w:t>Si el monto después del descuento es 0, el impuesto y el total también deben ser 0. Este caso comprueba el límite inferior de ambos cálculos.</w:t>
+      </w:r>
+    </w:p>
+    <w:p>
       <w:pPr>
         <w:pStyle w:val="Heading2"/>
       </w:pPr>
@@ -509,7 +528,7 @@
         <w:pStyle w:val="Heading3"/>
       </w:pPr>
       <w:r>
-        <w:t>test_calcular_impuesto_y_total</w:t>
+        <w:t>test_impuesto_es_dieciocho_por_ciento_del_monto_descontado_y_se_suma_al_total</w:t>
       </w:r>
     </w:p>
     <w:p>
@@ -525,7 +544,7 @@
         </w:rPr>
         <w:t xml:space="preserve">    [Fact]</w:t>
         <w:br/>
-        <w:t xml:space="preserve">    public void test_calcular_impuesto_y_total()</w:t>
+        <w:t xml:space="preserve">    public void test_impuesto_es_dieciocho_por_ciento_del_monto_descontado_y_se_suma_al_total()</w:t>
         <w:br/>
         <w:t xml:space="preserve">    {</w:t>
         <w:br/>
@@ -556,6 +575,54 @@
         <w:t xml:space="preserve">        Assert.Equal(16.20m, impuesto);</w:t>
         <w:br/>
         <w:t xml:space="preserve">        Assert.Equal(106.20m, total);</w:t>
+        <w:br/>
+        <w:t xml:space="preserve">    }</w:t>
+      </w:r>
+    </w:p>
+    <w:p>
+      <w:pPr>
+        <w:pStyle w:val="Heading3"/>
+      </w:pPr>
+      <w:r>
+        <w:t>test_monto_descontado_cero_produce_impuesto_y_total_cero</w:t>
+      </w:r>
+    </w:p>
+    <w:p>
+      <w:pPr>
+        <w:spacing w:before="20" w:after="160" w:line="240" w:lineRule="auto"/>
+        <w:ind w:left="259"/>
+      </w:pPr>
+      <w:r>
+        <w:rPr>
+          <w:rFonts w:ascii="Consolas" w:hAnsi="Consolas"/>
+          <w:color w:val="242F3E"/>
+          <w:sz w:val="14"/>
+        </w:rPr>
+        <w:t xml:space="preserve">    [Fact]</w:t>
+        <w:br/>
+        <w:t xml:space="preserve">    public void test_monto_descontado_cero_produce_impuesto_y_total_cero()</w:t>
+        <w:br/>
+        <w:t xml:space="preserve">    {</w:t>
+        <w:br/>
+        <w:t xml:space="preserve">        // Arrange</w:t>
+        <w:br/>
+        <w:t xml:space="preserve">        var service = new PedidoService();</w:t>
+        <w:br/>
+        <w:t xml:space="preserve">        var montoConDescuento = 0m;</w:t>
+        <w:br/>
+        <w:br/>
+        <w:t xml:space="preserve">        // Act</w:t>
+        <w:br/>
+        <w:t xml:space="preserve">        var impuesto = service.CalcularImpuesto(montoConDescuento);</w:t>
+        <w:br/>
+        <w:t xml:space="preserve">        var total = service.CalcularTotal(montoConDescuento, impuesto);</w:t>
+        <w:br/>
+        <w:br/>
+        <w:t xml:space="preserve">        // Assert</w:t>
+        <w:br/>
+        <w:t xml:space="preserve">        Assert.Equal(0m, impuesto);</w:t>
+        <w:br/>
+        <w:t xml:space="preserve">        Assert.Equal(0m, total);</w:t>
         <w:br/>
         <w:t xml:space="preserve">    }</w:t>
       </w:r>
@@ -638,7 +705,7 @@
         <w:pStyle w:val="Heading3"/>
       </w:pPr>
       <w:r>
-        <w:t>test_recuperar_pedido_por_identificador</w:t>
+        <w:t>test_recuperar_pedido_devuelve_resultado_del_repositorio_para_el_id</w:t>
       </w:r>
     </w:p>
     <w:p>
@@ -654,7 +721,7 @@
         </w:rPr>
         <w:t xml:space="preserve">    [Fact]</w:t>
         <w:br/>
-        <w:t xml:space="preserve">    public void test_recuperar_pedido_por_identificador()</w:t>
+        <w:t xml:space="preserve">    public void test_recuperar_pedido_devuelve_resultado_del_repositorio_para_el_id()</w:t>
         <w:br/>
         <w:t xml:space="preserve">    {</w:t>
         <w:br/>

</xml_diff>